<commit_message>
Improve project README and report walkthrough
</commit_message>
<xml_diff>
--- a/docs/research_report.docx
+++ b/docs/research_report.docx
@@ -169,7 +169,324 @@
         <w:t>### Feature Space Control</w:t>
         <w:br/>
         <w:br/>
-        <w:t>To make the training workflow practical on</w:t>
+        <w:t>To make the training workflow practical on the real dataset:</w:t>
+        <w:br/>
+        <w:br/>
+        <w:t>- extremely sparse columns are filtered by missing-ratio threshold</w:t>
+        <w:br/>
+        <w:t>- numeric and categorical feature counts are capped</w:t>
+        <w:br/>
+        <w:t>- feature selection is applied in the hybrid model path</w:t>
+        <w:br/>
+        <w:br/>
+        <w:t>## 5. Imbalance Handling</w:t>
+        <w:br/>
+        <w:br/>
+        <w:t>Two imbalance strategies were explicitly compared:</w:t>
+        <w:br/>
+        <w:br/>
+        <w:t>1. `class_weight`</w:t>
+        <w:br/>
+        <w:t>2. `SMOTE`</w:t>
+        <w:br/>
+        <w:br/>
+        <w:t>This satisfies the assignment requirement to compare at least two imbalance-handling strategies.</w:t>
+        <w:br/>
+        <w:br/>
+        <w:t>## 6. Models Implemented</w:t>
+        <w:br/>
+        <w:br/>
+        <w:t>The required model families were implemented:</w:t>
+        <w:br/>
+        <w:br/>
+        <w:t>1. XGBoost</w:t>
+        <w:br/>
+        <w:t>2. LightGBM</w:t>
+        <w:br/>
+        <w:t>3. Hybrid Random Forest + feature selection</w:t>
+        <w:br/>
+        <w:br/>
+        <w:t>These were evaluated in both:</w:t>
+        <w:br/>
+        <w:br/>
+        <w:t>- standard training mode</w:t>
+        <w:br/>
+        <w:t>- cost-sensitive training mode</w:t>
+        <w:br/>
+        <w:br/>
+        <w:t>## 7. Experimental Results</w:t>
+        <w:br/>
+        <w:br/>
+        <w:t>### Best Selected Configuration</w:t>
+        <w:br/>
+        <w:br/>
+        <w:t>The best configuration chosen by the project scoring logic was:</w:t>
+        <w:br/>
+        <w:br/>
+        <w:t>- Model: `XGBoost`</w:t>
+        <w:br/>
+        <w:t>- Imbalance strategy: `class_weight`</w:t>
+        <w:br/>
+        <w:t>- Cost strategy: `cost_sensitive`</w:t>
+        <w:br/>
+        <w:br/>
+        <w:t>Best recorded metrics:</w:t>
+        <w:br/>
+        <w:br/>
+        <w:t>- Precision: `0.034903998969116445`</w:t>
+        <w:br/>
+        <w:t>- Recall: `0.999753937007874`</w:t>
+        <w:br/>
+        <w:t>- F1-score: `0.06745303771094638`</w:t>
+        <w:br/>
+        <w:t>- AUC-ROC: `0.8941891839491015`</w:t>
+        <w:br/>
+        <w:t>- Confusion matrix: `[[1702, 112342], [1, 4063]]`</w:t>
+        <w:br/>
+        <w:br/>
+        <w:t>### Comparative Findings</w:t>
+        <w:br/>
+        <w:br/>
+        <w:t>Important comparison outcomes from the real IEEE-CIS run:</w:t>
+        <w:br/>
+        <w:br/>
+        <w:t>- Standard LightGBM achieved the strongest AUC-ROC: `0.9070918321482218`</w:t>
+        <w:br/>
+        <w:t>- Cost-sensitive XGBoost achieved the highest recall: `0.999753937007874`</w:t>
+        <w:br/>
+        <w:t>- Cost-sensitive models significantly increased recall but also increased false positives</w:t>
+        <w:br/>
+        <w:t>- SMOTE helped some models but did not consistently outperform class weighting on the selected scoring rule</w:t>
+        <w:br/>
+        <w:br/>
+        <w:t>This shows the exact business trade-off required in fraud detection:</w:t>
+        <w:br/>
+        <w:br/>
+        <w:t>- very high recall reduces missed fraud</w:t>
+        <w:br/>
+        <w:t>- aggressive fraud capture raises false-positive investigations</w:t>
+        <w:br/>
+        <w:br/>
+        <w:t>## 8. Cost-Sensitive Learning Analysis</w:t>
+        <w:br/>
+        <w:br/>
+        <w:t>The project compares standard training with cost-sensitive training by assigning a higher penalty to the fraud class.</w:t>
+        <w:br/>
+        <w:br/>
+        <w:t>Observed business interpretation:</w:t>
+        <w:br/>
+        <w:br/>
+        <w:t>- false negatives are expensive because they represent real fraud loss</w:t>
+        <w:br/>
+        <w:t>- false positives increase manual review cost and customer friction</w:t>
+        <w:br/>
+        <w:t>- the cost-sensitive configuration successfully drove recall upward</w:t>
+        <w:br/>
+        <w:t>- however, the operating threshold used here produced a very high false-positive rate for the best-recall model</w:t>
+        <w:br/>
+        <w:br/>
+        <w:t>This is a realistic production trade-off and should be discussed clearly in the viva.</w:t>
+        <w:br/>
+        <w:br/>
+        <w:t>## 9. Drift Simulation</w:t>
+        <w:br/>
+        <w:br/>
+        <w:t>The project uses time-based drift instead of random noise:</w:t>
+        <w:br/>
+        <w:br/>
+        <w:t>- train on earlier observations</w:t>
+        <w:br/>
+        <w:t>- evaluate on later observations</w:t>
+        <w:br/>
+        <w:t>- simulate shifted distributions in later slices</w:t>
+        <w:br/>
+        <w:t>- monitor drift with feature-level KS statistics</w:t>
+        <w:br/>
+        <w:br/>
+        <w:t>Observed drift summary:</w:t>
+        <w:br/>
+        <w:br/>
+        <w:t>- Overall drift score: `0.0045620762750541045`</w:t>
+        <w:br/>
+        <w:t>- Strong drift signals were detected for `TransactionDT`, `TransactionAmt`, `card1`, `card2`, and `card3`</w:t>
+        <w:br/>
+        <w:br/>
+        <w:t>This satisfies the requirement for more realistic drift simulation.</w:t>
+        <w:br/>
+        <w:br/>
+        <w:t>## 10. Intelligent Retraining Strategy</w:t>
+        <w:br/>
+        <w:br/>
+        <w:t>The repository implements a threshold-based retraining strategy:</w:t>
+        <w:br/>
+        <w:br/>
+        <w:t>- trigger retraining when monitored recall drops below threshold</w:t>
+        <w:br/>
+        <w:t>- trigger retraining when data drift exceeds threshold</w:t>
+        <w:br/>
+        <w:br/>
+        <w:t>The intelligent</w:t>
+      </w:r>
+    </w:p>
+    <w:p>
+      <w:pPr>
+        <w:pStyle w:val="Heading1"/>
+      </w:pPr>
+      <w:r>
+        <w:t>Complete Project Walkthrough</w:t>
+      </w:r>
+    </w:p>
+    <w:p>
+      <w:r>
+        <w:t># Complete Project Overview</w:t>
+        <w:br/>
+        <w:br/>
+        <w:t>## Project Name</w:t>
+        <w:br/>
+        <w:br/>
+        <w:t>IEEE-CIS Fraud Detection MLOps Platform</w:t>
+        <w:br/>
+        <w:br/>
+        <w:t>## Problem Solved</w:t>
+        <w:br/>
+        <w:br/>
+        <w:t>Financial fraud detection is not only a machine-learning problem. A real fraud system must detect suspicious transactions with high recall, handle severe class imbalance, scale under large transaction volume, and respond automatically when model performance or data quality degrades.</w:t>
+        <w:br/>
+        <w:br/>
+        <w:t>This project solves that full production problem by building a complete MLOps platform around the IEEE-CIS Fraud Detection dataset.</w:t>
+        <w:br/>
+        <w:br/>
+        <w:t>## End-to-End Solution</w:t>
+        <w:br/>
+        <w:br/>
+        <w:t>The system starts from raw IEEE-CIS transaction and identity data, validates and preprocesses the data, engineers features, trains multiple fraud-detection models, compares imbalance and cost-sensitive learning strategies, evaluates business-critical metrics, and then deploys the inference service with monitoring and automated retraining triggers.</w:t>
+        <w:br/>
+        <w:br/>
+        <w:t>## Full Workflow</w:t>
+        <w:br/>
+        <w:br/>
+        <w:t>1. Raw IEEE-CIS transaction and identity CSV files are loaded.</w:t>
+        <w:br/>
+        <w:t>2. Data is merged using `TransactionID`.</w:t>
+        <w:br/>
+        <w:t>3. Missing values are handled with scalable imputation strategies.</w:t>
+        <w:br/>
+        <w:t>4. High-cardinality categorical features are frequency encoded.</w:t>
+        <w:br/>
+        <w:t>5. Low-cardinality categorical features are one-hot encoded.</w:t>
+        <w:br/>
+        <w:t>6. Class imbalance is handled using both `class_weight` and `SMOTE`.</w:t>
+        <w:br/>
+        <w:t>7. XGBoost, LightGBM, and hybrid Random Forest models are trained.</w:t>
+        <w:br/>
+        <w:t>8. Standard training is compared with cost-sensitive training.</w:t>
+        <w:br/>
+        <w:t>9. Models are evaluated using precision, recall, F1-score, AUC-ROC, and confusion matrix.</w:t>
+        <w:br/>
+        <w:t>10. Drift is simulated using time-based distribution shifts.</w:t>
+        <w:br/>
+        <w:t>11. SHAP explainability is generated for fraud prediction interpretation.</w:t>
+        <w:br/>
+        <w:t>12. The inference model is served through FastAPI.</w:t>
+        <w:br/>
+        <w:t>13. Docker images are built for training and inference.</w:t>
+        <w:br/>
+        <w:t>14. Kubernetes manifests deploy the service in an isolated namespace.</w:t>
+        <w:br/>
+        <w:t>15. Kubeflow Pipelines orchestrates the ML workflow.</w:t>
+        <w:br/>
+        <w:t>16. Prometheus collects system, model, and data metrics.</w:t>
+        <w:br/>
+        <w:t>17. Grafana visualizes system health, model performance, and data drift.</w:t>
+        <w:br/>
+        <w:t>18. Prometheus alerts detect recall drops, drift, and latency spikes.</w:t>
+        <w:br/>
+        <w:t>19. Alertmanager forwards critical alerts to Jenkins.</w:t>
+        <w:br/>
+        <w:t>20. Jenkins runs the CI/CD retraining workflow.</w:t>
+        <w:br/>
+        <w:br/>
+        <w:t>## Main Technologies Used</w:t>
+        <w:br/>
+        <w:br/>
+        <w:t>- Python</w:t>
+        <w:br/>
+        <w:t>- Pandas</w:t>
+        <w:br/>
+        <w:t>- Scikit-learn</w:t>
+        <w:br/>
+        <w:t>- XGBoost</w:t>
+        <w:br/>
+        <w:t>- LightGBM</w:t>
+        <w:br/>
+        <w:t>- SMOTE</w:t>
+        <w:br/>
+        <w:t>- SHAP</w:t>
+        <w:br/>
+        <w:t>- FastAPI</w:t>
+        <w:br/>
+        <w:t>- Docker</w:t>
+        <w:br/>
+        <w:t>- Kubernetes</w:t>
+        <w:br/>
+        <w:t>- Kubeflow Pipelines</w:t>
+        <w:br/>
+        <w:t>- Prometheus</w:t>
+        <w:br/>
+        <w:t>- Alertmanager</w:t>
+        <w:br/>
+        <w:t>- Grafana</w:t>
+        <w:br/>
+        <w:t>- Jenkins</w:t>
+        <w:br/>
+        <w:t>- GitHub Actions</w:t>
+        <w:br/>
+        <w:br/>
+        <w:t>## What Makes This Project Valuable</w:t>
+        <w:br/>
+        <w:br/>
+        <w:t>This project demonstrates a production-style fraud detection system rather than a simple notebook. It includes the ML model, deployment layer, monitoring layer, alerting layer, CI/CD workflow, and retraining strategy.</w:t>
+        <w:br/>
+        <w:br/>
+        <w:t>The most important business value is reducing missed fraud through high recall while still documenting the false-positive trade-off.</w:t>
+        <w:br/>
+        <w:br/>
+        <w:t>## Evidence Included</w:t>
+        <w:br/>
+        <w:br/>
+        <w:t>The repository includes screenshots, logs, and reports proving:</w:t>
+        <w:br/>
+        <w:br/>
+        <w:t>- Real IEEE-CIS data was used.</w:t>
+        <w:br/>
+        <w:t>- Models were trained and compared.</w:t>
+        <w:br/>
+        <w:t>- Cost-sensitive learning was evaluated.</w:t>
+        <w:br/>
+        <w:t>- Drift was simulated and measured.</w:t>
+        <w:br/>
+        <w:t>- SHAP explainability was generated.</w:t>
+        <w:br/>
+        <w:t>- Docker images were built.</w:t>
+        <w:br/>
+        <w:t>- Kubernetes deployment succeeded.</w:t>
+        <w:br/>
+        <w:t>- Kubeflow Pipelines was installed and a pipeline was submitted.</w:t>
+        <w:br/>
+        <w:t>- Prometheus and Grafana ran live.</w:t>
+        <w:br/>
+        <w:t>- Prometheus alert fired.</w:t>
+        <w:br/>
+        <w:t>- Alertmanager triggered Jenkins.</w:t>
+        <w:br/>
+        <w:t>- Jenkins pipeline completed successfully.</w:t>
+        <w:br/>
+        <w:br/>
+        <w:t>## Final Outcome</w:t>
+        <w:br/>
+        <w:br/>
+        <w:t>The project delivers a complete fraud-detection MLOps platform that can be presented to an instructor, evaluator, or client as an end-to-end solution for fraud monitoring, deployment, and retraining automation.</w:t>
+        <w:br/>
       </w:r>
     </w:p>
     <w:p>
@@ -409,7 +726,87 @@
         <w:br/>
         <w:t>- Local Prometheus config used for live run: `monitoring/prometheus-local.yml`</w:t>
         <w:br/>
-        <w:t>- Alert rules: `moni</w:t>
+        <w:t>- Alert rules: `monitoring/alert_rules.yml`</w:t>
+        <w:br/>
+        <w:t>- Grafana dashboards:</w:t>
+        <w:br/>
+        <w:t xml:space="preserve">  - `monitoring/grafana/dashboards/system-health.json`</w:t>
+        <w:br/>
+        <w:t xml:space="preserve">  - `monitoring/grafana/dashboards/model-performance.json`</w:t>
+        <w:br/>
+        <w:t xml:space="preserve">  - `monitoring/grafana/dashboards/data-drift.json`</w:t>
+        <w:br/>
+        <w:t>- Live monitoring evidence:</w:t>
+        <w:br/>
+        <w:t xml:space="preserve">  - `docs/evidence/logs/prometheus_health.txt`</w:t>
+        <w:br/>
+        <w:t xml:space="preserve">  - `docs/evidence/logs/prometheus_targets.json`</w:t>
+        <w:br/>
+        <w:t xml:space="preserve">  - `docs/evidence/logs/prometheus_query_requests.json`</w:t>
+        <w:br/>
+        <w:t xml:space="preserve">  - `docs/evidence/logs/grafana_health.json`</w:t>
+        <w:br/>
+        <w:t xml:space="preserve">  - `docs/evidence/logs/grafana_dashboards.json`</w:t>
+        <w:br/>
+        <w:t xml:space="preserve">  - `docs/evidence/logs/alertmanager_alerts.json`</w:t>
+        <w:br/>
+        <w:t xml:space="preserve">  - `docs/evidence/logs/jenkins_alertmanager_console.log`</w:t>
+        <w:br/>
+        <w:br/>
+        <w:t>## Task 7: Drift Simulation</w:t>
+        <w:br/>
+        <w:br/>
+        <w:t>### Coverage</w:t>
+        <w:br/>
+        <w:br/>
+        <w:t>- Drift simulation and measurement: `src/fraud_mlops/drift.py`</w:t>
+        <w:br/>
+        <w:t>- Real drift results: `artifacts/metrics_summary.json`</w:t>
+        <w:br/>
+        <w:br/>
+        <w:t>## Task 8: Intelligent Retraining Strategy</w:t>
+        <w:br/>
+        <w:br/>
+        <w:t>### Coverage</w:t>
+        <w:br/>
+        <w:br/>
+        <w:t>- Threshold-based retraining strategy implemented</w:t>
+        <w:br/>
+        <w:t>- Trigger helper updated for both `gte` and `lte` comparisons</w:t>
+        <w:br/>
+        <w:t>- Live alert-driven retraining event artifact:</w:t>
+        <w:br/>
+        <w:t xml:space="preserve">  - `artifacts/live_alert_retraining_event.json`</w:t>
+        <w:br/>
+        <w:br/>
+        <w:t>## Task 9: Explainability</w:t>
+        <w:br/>
+        <w:br/>
+        <w:t>### Coverage</w:t>
+        <w:br/>
+        <w:br/>
+        <w:t>- SHAP generation: `src/fraud_mlops/explainability.py`</w:t>
+        <w:br/>
+        <w:t>- Artifact: `artifacts/shap_summary.png`</w:t>
+        <w:br/>
+        <w:br/>
+        <w:t>## Report and Screenshots</w:t>
+        <w:br/>
+        <w:br/>
+        <w:t>### Coverage</w:t>
+        <w:br/>
+        <w:br/>
+        <w:t>- Word report: `docs/research_report.docx`</w:t>
+        <w:br/>
+        <w:t>- Markdown report: `docs/research_report.md`</w:t>
+        <w:br/>
+        <w:t>- Evidence images:</w:t>
+        <w:br/>
+        <w:t xml:space="preserve">  - `docs/evidence/*.png`</w:t>
+        <w:br/>
+        <w:br/>
+        <w:t>Each evidence image is included in the Word report with explanatory context.</w:t>
+        <w:br/>
       </w:r>
     </w:p>
     <w:p>

</xml_diff>